<commit_message>
update grade to 80
Instructor adjustment: the one-point CSS deduction for hand-typed colors
is dropped. No student code is modified.

Co-Authored-By: Claude Fable 5.1 <noreply@anthropic.com>
</commit_message>
<xml_diff>
--- a/feedback/Elliot-Radov-Project-1-Feedback.docx
+++ b/feedback/Elliot-Radov-Project-1-Feedback.docx
@@ -74,7 +74,7 @@
         </w:rPr>
         <w:t xml:space="preserve">Repo: </w:t>
       </w:r>
-      <w:hyperlink w:history="1" r:id="rIdqtu315kkdnus-bv8ax32f">
+      <w:hyperlink w:history="1" r:id="rIdpt6grrface60obtvergtw">
         <w:r>
           <w:rPr>
             <w:rStyle w:val="Hyperlink"/>
@@ -92,7 +92,7 @@
         </w:rPr>
         <w:t xml:space="preserve">Live: </w:t>
       </w:r>
-      <w:hyperlink w:history="1" r:id="rId7d8hfth9sy_qa6emydheu">
+      <w:hyperlink w:history="1" r:id="rId9vmwqi7frgidcjppefjij">
         <w:r>
           <w:rPr>
             <w:rStyle w:val="Hyperlink"/>
@@ -120,7 +120,7 @@
           <w:sz w:val="40"/>
           <w:szCs w:val="40"/>
         </w:rPr>
-        <w:t xml:space="preserve">Grade: 79 / 100</w:t>
+        <w:t xml:space="preserve">Grade: 80 / 100</w:t>
       </w:r>
     </w:p>
     <w:tbl>
@@ -408,7 +408,7 @@
                 <w:b w:val="false"/>
                 <w:bCs w:val="false"/>
               </w:rPr>
-              <w:t xml:space="preserve">18</w:t>
+              <w:t xml:space="preserve">19</w:t>
             </w:r>
           </w:p>
         </w:tc>
@@ -893,7 +893,7 @@
                 <w:b w:val="false"/>
                 <w:bCs w:val="false"/>
               </w:rPr>
-              <w:t xml:space="preserve">79</w:t>
+              <w:t xml:space="preserve">80</w:t>
             </w:r>
           </w:p>
         </w:tc>
@@ -969,7 +969,7 @@
         <w:spacing w:after="120"/>
       </w:pPr>
       <w:r>
-        <w:t xml:space="preserve">The grade is in the seventies rather than the eighties because the site stops at the skeleton. The whole thing is 123 lines of HTML and 138 of CSS. On a desktop the text runs edge to edge across 1240 pixels because nothing sets a max-width. The menu items are three headings in a grid with no card around them. The order form, which is the page's reason to exist, has a #form-message paragraph waiting for a confirmation that no script ever writes, so submitting it reloads the page and empties every field. Dark mode leaves the inputs white. And the hero image is a 2.2 MB PNG of the same three bowls the menu lists underneath it, with names and prices baked into the pixels, one of which does not match the text. None of this is hard to fix. The roadmap at the end is three evenings.</w:t>
+        <w:t xml:space="preserve">The grade is an 80 rather than a 90 because the site stops at the skeleton. The whole thing is 123 lines of HTML and 138 of CSS. On a desktop the text runs edge to edge across 1240 pixels because nothing sets a max-width. The menu items are three headings in a grid with no card around them. The order form, which is the page's reason to exist, has a #form-message paragraph waiting for a confirmation that no script ever writes, so submitting it reloads the page and empties every field. Dark mode leaves the inputs white. And the hero image is a 2.2 MB PNG of the same three bowls the menu lists underneath it, with names and prices baked into the pixels, one of which does not match the text. None of this is hard to fix. The roadmap at the end is three evenings.</w:t>
       </w:r>
     </w:p>
     <w:p>
@@ -2230,7 +2230,7 @@
         <w:spacing w:after="120" w:before="360"/>
       </w:pPr>
       <w:r>
-        <w:t xml:space="preserve">CSS layout: 18 / 25</w:t>
+        <w:t xml:space="preserve">CSS layout: 19 / 25</w:t>
       </w:r>
     </w:p>
     <w:p>

</xml_diff>